<commit_message>
Mint Human Rights Version 2.1 (approved by Jeppe Andersen)
Jeppe approved the round-2 change. Minted Version 2.1 (2026-06): p.5 Modern
Slavery 'Australia and UK' -> 'Only UK and AUS'. Version 2 (2026-05) frozen
to its pre-change source so it keeps rendering the old content; both editions
now coexist in the version story with their own PDF/Word.

Co-Authored-By: Claude Opus 4.8 <noreply@anthropic.com>
Claude-Session: https://claude.ai/code/session_01W3gw8scX9B7oMC33JPxjbS
</commit_message>
<xml_diff>
--- a/docs/files/Human_Rights_Policy__Policy_2026-05.docx
+++ b/docs/files/Human_Rights_Policy__Policy_2026-05.docx
@@ -19,7 +19,7 @@
               <a:graphicData uri="http://schemas.openxmlformats.org/drawingml/2006/picture">
                 <pic:pic>
                   <pic:nvPicPr>
-                    <pic:cNvPr id="0" name="tmpcngf9xr_.png"/>
+                    <pic:cNvPr id="0" name="tmpuk2_o4sp.png"/>
                     <pic:cNvPicPr/>
                   </pic:nvPicPr>
                   <pic:blipFill>
@@ -694,7 +694,7 @@
           <w:color w:val="1C4076"/>
           <w:sz w:val="22"/>
         </w:rPr>
-        <w:t>Modern Slavery Policy (Only UK and AUS)</w:t>
+        <w:t>Modern Slavery Policy (Australia and UK)</w:t>
       </w:r>
     </w:p>
     <w:p>

</xml_diff>